<commit_message>
v2.2.4: focus restore from series; no sidebar/category-rail flicker
- Back from a series now scrolls the grid to the opened series and focuses it,
  instead of focus falling to the sidebar (the scroll-then-focus restore Movies
  already used).
- The sidebar no longer briefly expands/collapses while navigating Settings
  sub-screens: it expands only after focus settles (~120ms) and collapses
  instantly. Shared component, so it applies to every section.
- The category rail (Live TV / Movies / Series) gets the same settle-before-
  expand treatment, fixing the equivalent flicker there.
</commit_message>
<xml_diff>
--- a/extras/OwnTV_Complete_Brief_Plan_With_Logo.docx
+++ b/extras/OwnTV_Complete_Brief_Plan_With_Logo.docx
@@ -3211,6 +3211,84 @@
       </w:pPr>
       <w:r>
         <w:t>Category search — the folder rail (Live TV / Movies / Series) gained a search box at its top, implemented inside the shared CategoryRail composable so all three sections get it from one change. It filters categories by name while preserving each category's ORIGINAL index, so selection highlighting and onSelect stay correct on the filtered list. Focusing the rail now lands directly on the search box (scrolled to top) so the user can type immediately; Down drops into the list, and the query resets when the rail loses focus. Reuses the app's two-stage TV SearchBar (OK opens the keyboard, Back closes it) so there's no IME trap.</w:t>
+      </w:r>
+    </w:p>
+    <w:p>
+      <w:pPr>
+        <w:pStyle w:val="694"/>
+      </w:pPr>
+      <w:r>
+        <w:t>12.15 v2.2.2–v2.2.4: focus polish, MPEG-TS compatibility &amp; resilience</w:t>
+      </w:r>
+    </w:p>
+    <w:p>
+      <w:pPr/>
+      <w:r>
+        <w:t>Three quick maintenance releases driven by user/Reddit reports — focus consistency, stream compatibility and playback resilience.</w:t>
+      </w:r>
+    </w:p>
+    <w:p>
+      <w:pPr>
+        <w:pStyle w:val="723"/>
+      </w:pPr>
+      <w:r>
+        <w:t>v2.2.2 — Category rail highlight now strictly follows focus. The green 'active category' fill only shows when that pill is BOTH the current category AND the focused one (decided inside RailPill); a selected-but-unfocused pill shows nothing, and the sidebar/content focus no longer lights up a second category. So exactly one pill is ever highlighted (where the remote is), and the active category reveals itself by turning green when you land on it.</w:t>
+      </w:r>
+    </w:p>
+    <w:p>
+      <w:pPr>
+        <w:pStyle w:val="723"/>
+      </w:pPr>
+      <w:r>
+        <w:t>v2.2.3 — MPEG-TS live compatibility: Xtream live URLs now default to the universal '.ts' (MPEG-TS) endpoint instead of '.m3u8'/HLS, which some panels don't serve (their channels failed to load entirely). If a live '.ts' stream still won't start, the player automatically falls back to the '.m3u8' variant of the same channel before erroring, so the rare HLS-only panel keeps working. (URLs are baked at sync time, so a re-sync is needed to pick up the change — surfaced as a release callout.)</w:t>
+      </w:r>
+    </w:p>
+    <w:p>
+      <w:pPr>
+        <w:pStyle w:val="723"/>
+      </w:pPr>
+      <w:r>
+        <w:t>v2.2.3 — Player Back is now two-step: the first Back hides the controls instead of leaving the channel; a second Back (controls hidden) exits. Errors/dialogs are unaffected.</w:t>
+      </w:r>
+    </w:p>
+    <w:p>
+      <w:pPr>
+        <w:pStyle w:val="723"/>
+      </w:pPr>
+      <w:r>
+        <w:t>v2.2.3 — Silent auto-retry hardened: exponential backoff (1s/2s/4s) to ride out the TCL cold-boot decoder lag; an offline bypass that shows the 'No internet' error immediately instead of spinning through retries (via ConnectivityObserver); and a faster-fail for VOD (1 attempt vs 3 for live, since VOD failures are usually bad links).</w:t>
+      </w:r>
+    </w:p>
+    <w:p>
+      <w:pPr>
+        <w:pStyle w:val="723"/>
+      </w:pPr>
+      <w:r>
+        <w:t>v2.2.3 — Channel zapping (CH+/CH-) now works from the TV Guide too, not just the Live list: tuning a guide channel arms the guide's channel list, and the shell routes CH+/CH- to whichever section (Live or Guide) opened the current stream.</w:t>
+      </w:r>
+    </w:p>
+    <w:p>
+      <w:pPr>
+        <w:pStyle w:val="723"/>
+      </w:pPr>
+      <w:r>
+        <w:t>v2.2.4 — Back from a series now returns focus to the poster you opened (it scrolls the grid to the selected series then focuses it, the same scroll-then-focus fix Movies already had) instead of jumping to the sidebar.</w:t>
+      </w:r>
+    </w:p>
+    <w:p>
+      <w:pPr>
+        <w:pStyle w:val="723"/>
+      </w:pPr>
+      <w:r>
+        <w:t>v2.2.4 — The left sidebar no longer flickers open/closed while navigating Settings sub-screens. A submenu unmounting routes focus through the sidebar for a moment before the settings row reclaims it; the sidebar now only expands after focus settles (~120ms) and collapses instantly, so a transient blip can't flash it open.</w:t>
+      </w:r>
+    </w:p>
+    <w:p>
+      <w:pPr>
+        <w:pStyle w:val="723"/>
+      </w:pPr>
+      <w:r>
+        <w:t>v2.2.4 — The same settle-before-expand debounce was applied to the category rail (Live TV / Movies / Series), fixing the equivalent flicker when focus passes through it during a transition. Both the sidebar (panel 1, shared across all sections incl. the Guide) and the category rail (panel 2) now widen only after focus settles (~120ms) and collapse instantly.</w:t>
       </w:r>
     </w:p>
     <w:sectPr>

</xml_diff>